<commit_message>
Release Penny 3.2 with safer voice amounts, Settings, reset and diagnostics
</commit_message>
<xml_diff>
--- a/docs/Penny-Journey-Map.docx
+++ b/docs/Penny-Journey-Map.docx
@@ -38,14 +38,7 @@
         <w:spacing w:before="0" w:after="320" w:line="278" w:lineRule="auto"/>
       </w:pPr>
       <w:r>
-        <w:rPr>
-          <w:rFonts w:ascii="Aptos" w:hAnsi="Aptos"/>
-          <w:b w:val="0"/>
-          <w:i w:val="0"/>
-          <w:color w:val="5B716D"/>
-          <w:sz w:val="19"/>
-        </w:rPr>
-        <w:t>14 October 2026  |  A story of product choices, a voice lesson, and a practical release path</w:t>
+        <w:t>14 October 2026  |  A story of product choices, a voice lesson, and a practical release path | Updated 19 October 2026 for V3.2</w:t>
       </w:r>
     </w:p>
     <w:tbl>
@@ -2405,6 +2398,112 @@
         </w:tc>
       </w:tr>
     </w:tbl>
+    <w:p>
+      <w:r>
+        <w:br w:type="page"/>
+      </w:r>
+    </w:p>
+    <w:p>
+      <w:pPr>
+        <w:pStyle w:val="Title"/>
+      </w:pPr>
+      <w:r>
+        <w:rPr>
+          <w:color w:val="000000"/>
+        </w:rPr>
+        <w:t>Penny 3.2 release journey</w:t>
+      </w:r>
+    </w:p>
+    <w:p>
+      <w:r>
+        <w:t>19 October 2026 update: Penny 3.2 adds Settings, safer reset, private diagnostics and reviewed voice amount corrections. Earlier sections preserve the journey through 3.1; this update records the next chapter.</w:t>
+      </w:r>
+    </w:p>
+    <w:p>
+      <w:pPr>
+        <w:pStyle w:val="Heading2"/>
+      </w:pPr>
+      <w:r>
+        <w:rPr>
+          <w:color w:val="000000"/>
+        </w:rPr>
+        <w:t>A new request for a fresh start</w:t>
+      </w:r>
+    </w:p>
+    <w:p>
+      <w:r>
+        <w:t>The conversation moved from tracking expenses to controlling the whole experience: delete one month or all months, keep useful tags, and make a full reset unmistakable. Settings gathered the default budget, tags, backups and diagnostics without changing the familiar Add expense flow.</w:t>
+      </w:r>
+    </w:p>
+    <w:p>
+      <w:pPr>
+        <w:pStyle w:val="Heading2"/>
+      </w:pPr>
+      <w:r>
+        <w:rPr>
+          <w:color w:val="000000"/>
+        </w:rPr>
+        <w:t>The amount glitch became a permanent test</w:t>
+      </w:r>
+    </w:p>
+    <w:p>
+      <w:r>
+        <w:t>The owner reported that Hindi-mode voice did not fill Amount after Use English draft. The phrase “spend rs.50 on donation” exposed two gaps: prefix currency notation and a correction that was still treated as unresolved. The fix now carries the reviewed value into the form as ₹50.00. An unchanged ambiguous guess remains blocked.</w:t>
+      </w:r>
+    </w:p>
+    <w:p>
+      <w:pPr>
+        <w:pStyle w:val="Heading2"/>
+      </w:pPr>
+      <w:r>
+        <w:rPr>
+          <w:color w:val="000000"/>
+        </w:rPr>
+        <w:t>Evidence before the release</w:t>
+      </w:r>
+    </w:p>
+    <w:p>
+      <w:r>
+        <w:t>An independent review exposed additional money, date and log-purge edge cases. Those findings became regression tests. The final build passed 633 automated tests locally and in Docker. Browser checks confirmed the reported phrase, reset and undo, ordinary expense changes and responsive layouts.</w:t>
+      </w:r>
+    </w:p>
+    <w:p>
+      <w:pPr>
+        <w:pStyle w:val="Heading2"/>
+      </w:pPr>
+      <w:r>
+        <w:rPr>
+          <w:color w:val="000000"/>
+        </w:rPr>
+        <w:t>What remains a learning task</w:t>
+      </w:r>
+    </w:p>
+    <w:p>
+      <w:r>
+        <w:t>Typed transcripts do not prove microphone reliability. Real iPhone speech sessions, native-speaker review and full accessibility and usability acceptance remain open. Docker ran locally with health checks and a read-only filesystem; public registry images and cross-platform image validation are still separate work.</w:t>
+      </w:r>
+    </w:p>
+    <w:p>
+      <w:pPr>
+        <w:pStyle w:val="Heading2"/>
+      </w:pPr>
+      <w:r>
+        <w:rPr>
+          <w:color w:val="000000"/>
+        </w:rPr>
+        <w:t>The release instruction</w:t>
+      </w:r>
+    </w:p>
+    <w:p>
+      <w:r>
+        <w:t>On 19 October the owner asked to push to GitHub, update the documents and release. Version v3.2 carries the source, test evidence and these known limits together. The two-minute narrated demonstration remains a useful next companion; no completed recording is claimed.</w:t>
+      </w:r>
+    </w:p>
+    <w:p>
+      <w:r>
+        <w:t>Current evidence: V3.2-TEST-RESULTS.md and RELEASE-NOTES-v3.2.md in debasisr66/PennyExpenseManager.</w:t>
+      </w:r>
+    </w:p>
     <w:sectPr>
       <w:footerReference w:type="default" r:id="rId9"/>
       <w:pgSz w:w="12240" w:h="15840"/>

</xml_diff>